<commit_message>
feat: Add v7 and v8 modules for refractive index comparison and dispersion extrema analysis
- Implemented `comparison_report.py` to merge primary conclusions, systematic errors, and audit tracks for refractive index results.
- Created `dispersion_extrema.py` for mapping extrema to dispersion phase coordinates and robust thickness inversion across multiple scenarios.
- Developed `extrema_observation.py` to unify peak and valley detection results into auditable observations for v8.
- Introduced `identifiability_audit.py` to aggregate evidence of identifiability from joint calibration and carrier inference results.
- Added `intrinsic_scenario.py` for analyzing thickness sensitivity in intrinsic dispersion scenarios without inferring carrier concentration.
- Implemented `shared_thickness.py` for robust inversion of shared thickness across multiple angles and scenarios, including stability diagnostics.
</commit_message>
<xml_diff>
--- a/doc/2025B论文_问题一二三_详细版.docx
+++ b/doc/2025B论文_问题一二三_详细版.docx
@@ -2153,6 +2153,216 @@
     </w:p>
     <w:p>
       <w:pPr>
+        <w:spacing w:line="360" w:lineRule="auto" w:before="0" w:after="120"/>
+        <w:ind w:firstLine="0"/>
+        <w:jc w:val="both"/>
+      </w:pPr>
+      <w:r>
+        <w:rPr>
+          <w:rFonts w:ascii="Times New Roman" w:hAnsi="Times New Roman" w:eastAsia="黑体"/>
+          <w:b/>
+          <w:sz w:val="21"/>
+        </w:rPr>
+        <w:t>5.2.3 本征色散情景模型</w:t>
+      </w:r>
+    </w:p>
+    <w:p>
+      <w:pPr>
+        <w:spacing w:line="360" w:lineRule="auto" w:before="0" w:after="120"/>
+        <w:ind w:firstLine="420"/>
+        <w:jc w:val="both"/>
+      </w:pPr>
+      <w:r>
+        <w:rPr>
+          <w:rFonts w:ascii="Times New Roman" w:hAnsi="Times New Roman" w:eastAsia="宋体"/>
+          <w:b w:val="0"/>
+          <w:sz w:val="21"/>
+        </w:rPr>
+        <w:t>为分析常折射率假设带来的系统误差，本文增加本征色散情景模型。硅采用 Edwards–Ochoa 红外本征色散关系；碳化硅采用固定声子参数的单振子晶格模型。在本征情景中关闭自由载流子项，在低、中、高掺杂情景中使用预先给定的固定浓度，载流子浓度不作为优化变量。材料的复折射率统一写为</w:t>
+      </w:r>
+    </w:p>
+    <w:p>
+      <w:pPr>
+        <w:spacing w:line="360" w:lineRule="auto" w:before="0" w:after="120"/>
+        <w:ind w:firstLine="0"/>
+        <w:jc w:val="center"/>
+      </w:pPr>
+      <w:r>
+        <w:rPr>
+          <w:rFonts w:ascii="Times New Roman" w:hAnsi="Times New Roman" w:eastAsia="宋体"/>
+          <w:b w:val="0"/>
+          <w:sz w:val="21"/>
+        </w:rPr>
+        <w:t>ñ(ν̃)=√[ε_lattice(ν̃)+ε_Drude(ν̃,N_fixed)]　　(13)</w:t>
+      </w:r>
+    </w:p>
+    <w:p>
+      <w:pPr>
+        <w:spacing w:line="360" w:lineRule="auto" w:before="0" w:after="120"/>
+        <w:ind w:firstLine="0"/>
+        <w:jc w:val="both"/>
+      </w:pPr>
+      <w:r>
+        <w:rPr>
+          <w:rFonts w:ascii="Times New Roman" w:hAnsi="Times New Roman" w:eastAsia="宋体"/>
+          <w:b w:val="0"/>
+          <w:sz w:val="21"/>
+        </w:rPr>
+        <w:t>其中 N_fixed 由情景预先指定。本征情景取 N_fixed=0。由于外延层与衬底采用相同本征介电函数时界面反射会退化，本模型不利用绝对反射幅值反演厚度，而在透明区用复折射率实部修正干涉相位，并通过正余弦变量投影吸收未知振幅、基线与相位偏置。双角度共享的唯一关键非线性变量为厚度。</w:t>
+      </w:r>
+    </w:p>
+    <w:p>
+      <w:pPr>
+        <w:spacing w:line="360" w:lineRule="auto" w:before="0" w:after="120"/>
+        <w:ind w:firstLine="0"/>
+        <w:jc w:val="center"/>
+      </w:pPr>
+      <w:r>
+        <w:rPr>
+          <w:rFonts w:ascii="Times New Roman" w:hAnsi="Times New Roman" w:eastAsia="宋体"/>
+          <w:b w:val="0"/>
+          <w:sz w:val="21"/>
+        </w:rPr>
+        <w:t>d_s=arg min_d Σ_a ‖y_a−X_a[d,n_s(ν̃)]β̂_a‖²　　(14)</w:t>
+      </w:r>
+    </w:p>
+    <w:p>
+      <w:pPr>
+        <w:spacing w:line="360" w:lineRule="auto" w:before="0" w:after="120"/>
+        <w:ind w:firstLine="0"/>
+        <w:jc w:val="both"/>
+      </w:pPr>
+      <w:r>
+        <w:rPr>
+          <w:rFonts w:ascii="Times New Roman" w:hAnsi="Times New Roman" w:eastAsia="宋体"/>
+          <w:b w:val="0"/>
+          <w:sz w:val="21"/>
+        </w:rPr>
+        <w:t>依次计算本征、低、中、高四种固定情景的厚度，并将全部情景结果与常折射率主值共同形成系统误差包络。该包络只用于可靠性分析，不按拟合误差自动替换主厚度。</w:t>
+      </w:r>
+    </w:p>
+    <w:p>
+      <w:pPr>
+        <w:spacing w:line="360" w:lineRule="auto" w:before="0" w:after="120"/>
+        <w:ind w:firstLine="0"/>
+        <w:jc w:val="both"/>
+      </w:pPr>
+      <w:r>
+        <w:rPr>
+          <w:rFonts w:ascii="Times New Roman" w:hAnsi="Times New Roman" w:eastAsia="黑体"/>
+          <w:b/>
+          <w:sz w:val="21"/>
+        </w:rPr>
+        <w:t>5.2.4 自由浓度审计</w:t>
+      </w:r>
+    </w:p>
+    <w:p>
+      <w:pPr>
+        <w:spacing w:line="360" w:lineRule="auto" w:before="0" w:after="120"/>
+        <w:ind w:firstLine="420"/>
+        <w:jc w:val="both"/>
+      </w:pPr>
+      <w:r>
+        <w:rPr>
+          <w:rFonts w:ascii="Times New Roman" w:hAnsi="Times New Roman" w:eastAsia="宋体"/>
+          <w:b w:val="0"/>
+          <w:sz w:val="21"/>
+        </w:rPr>
+        <w:t>原有载流子复介电联合反演仍完整保留，但调整为审计路径。该路径同时开放厚度、外延层浓度与衬底浓度，并检查 Jacobian 条件数、参数相关性、先验边界、连续留段厚度稳定性、固定情景比较及浓度轮廓区间。只有全部证据支持时才允许解释浓度点估计；否则候选值仅作为不可辨识证据，不进入论文主结论。</w:t>
+      </w:r>
+    </w:p>
+    <w:p>
+      <w:pPr>
+        <w:spacing w:line="360" w:lineRule="auto" w:before="0" w:after="120"/>
+        <w:ind w:firstLine="0"/>
+        <w:jc w:val="both"/>
+      </w:pPr>
+      <w:r>
+        <w:rPr>
+          <w:rFonts w:ascii="Times New Roman" w:hAnsi="Times New Roman" w:eastAsia="黑体"/>
+          <w:b/>
+          <w:sz w:val="21"/>
+        </w:rPr>
+        <w:t>5.2.5 色散坐标多峰谷模型</w:t>
+      </w:r>
+    </w:p>
+    <w:p>
+      <w:pPr>
+        <w:spacing w:line="360" w:lineRule="auto" w:before="0" w:after="120"/>
+        <w:ind w:firstLine="420"/>
+        <w:jc w:val="both"/>
+      </w:pPr>
+      <w:r>
+        <w:rPr>
+          <w:rFonts w:ascii="Times New Roman" w:hAnsi="Times New Roman" w:eastAsia="宋体"/>
+          <w:b w:val="0"/>
+          <w:sz w:val="21"/>
+        </w:rPr>
+        <w:t>为同时保留极值法对基线的稳健性和色散模型对折射率变化的描述，本文进一步建立色散坐标多峰谷共享厚度模型。模型仍以透明波段筛选为前置条件，在本征及固定掺杂情景下，先将峰谷波数映射为光学相位坐标</w:t>
+      </w:r>
+    </w:p>
+    <w:p>
+      <w:pPr>
+        <w:spacing w:line="360" w:lineRule="auto" w:before="0" w:after="120"/>
+        <w:ind w:firstLine="0"/>
+        <w:jc w:val="center"/>
+      </w:pPr>
+      <w:r>
+        <w:rPr>
+          <w:rFonts w:ascii="Times New Roman" w:hAnsi="Times New Roman" w:eastAsia="宋体"/>
+          <w:b w:val="0"/>
+          <w:sz w:val="21"/>
+        </w:rPr>
+        <w:t>g_s,a(ν̃)=ν̃√[n_s²(ν̃)−sin²θ_a]　　(15)</w:t>
+      </w:r>
+    </w:p>
+    <w:p>
+      <w:pPr>
+        <w:spacing w:line="360" w:lineRule="auto" w:before="0" w:after="120"/>
+        <w:ind w:firstLine="0"/>
+        <w:jc w:val="both"/>
+      </w:pPr>
+      <w:r>
+        <w:rPr>
+          <w:rFonts w:ascii="Times New Roman" w:hAnsi="Times New Roman" w:eastAsia="宋体"/>
+          <w:b w:val="0"/>
+          <w:sz w:val="21"/>
+        </w:rPr>
+        <w:t>其中下标 s 表示本征、低、中、高固定折射率情景，下标 a 表示入射角。在该坐标中，同类极值的干涉级次近似线性增加。对10°峰、10°谷、15°峰和15°谷四条序列分别设置独立截距，以吸收未知绝对级次和峰谷反射相位差；四条序列共享同一厚度斜率：</w:t>
+      </w:r>
+    </w:p>
+    <w:p>
+      <w:pPr>
+        <w:spacing w:line="360" w:lineRule="auto" w:before="0" w:after="120"/>
+        <w:ind w:firstLine="0"/>
+        <w:jc w:val="center"/>
+      </w:pPr>
+      <w:r>
+        <w:rPr>
+          <w:rFonts w:ascii="Times New Roman" w:hAnsi="Times New Roman" w:eastAsia="宋体"/>
+          <w:b w:val="0"/>
+          <w:sz w:val="21"/>
+        </w:rPr>
+        <w:t>m_i=2d_cm g_s,a(ν̃_i)+c_j　　(16)</w:t>
+      </w:r>
+    </w:p>
+    <w:p>
+      <w:pPr>
+        <w:spacing w:line="360" w:lineRule="auto" w:before="0" w:after="120"/>
+        <w:ind w:firstLine="0"/>
+        <w:jc w:val="both"/>
+      </w:pPr>
+      <w:r>
+        <w:rPr>
+          <w:rFonts w:ascii="Times New Roman" w:hAnsi="Times New Roman" w:eastAsia="宋体"/>
+          <w:b w:val="0"/>
+          <w:sz w:val="21"/>
+        </w:rPr>
+        <w:t>相邻光学坐标间距相对中位间距的整数倍用于识别漏峰或漏谷；共享斜率采用稳健损失估计，并按残差中位绝对偏差审计异常极值。模型分别计算峰序列、谷序列、两个角度和连续三波段的厚度，只有这些结果同时稳定时，才采用本征色散情景作为名义厚度。低、中、高固定情景与常折射率结果共同构成模型系统范围。</w:t>
+      </w:r>
+    </w:p>
+    <w:p>
+      <w:pPr>
         <w:spacing w:line="360" w:lineRule="auto" w:before="160" w:after="120"/>
         <w:ind w:firstLine="0"/>
         <w:jc w:val="both"/>
@@ -2178,7 +2388,7 @@
           <w:b w:val="0"/>
           <w:sz w:val="21"/>
         </w:rPr>
-        <w:t>对附件一、二分别执行：选带 → 预处理 → FFT粗估 → 峰谷Theil–Sen → 有界精修 → 间距bootstrap；再计算双角度相对差并做逆方差加权融合。全过程使用同一阈值与随机种子规则，保证两角度可比。</w:t>
+        <w:t>对附件一、二分别执行：选带 → 预处理 → FFT粗估 → 峰谷Theil–Sen → 有界精修 → 间距bootstrap；再计算双角度相对差并做逆方差加权融合。随后执行本征与三档固定掺杂情景，只优化共享厚度并形成系统误差范围；在此基础上提取多组峰谷并映射到色散坐标，对四条序列进行共享厚度回归，再执行峰谷、角度、留段与重采样检验。最后运行保留的自由浓度审计路径，输出失败指标与回退依据。全过程使用同一阈值与随机种子规则，保证两角度可比。</w:t>
       </w:r>
     </w:p>
     <w:p>
@@ -2545,7 +2755,52 @@
           <w:b w:val="0"/>
           <w:sz w:val="21"/>
         </w:rPr>
-        <w:t>d_SiC ≈ 7.83 µm　　(13)</w:t>
+        <w:t>d_SiC,const ≈ 7.83 µm　　(17)</w:t>
+      </w:r>
+    </w:p>
+    <w:p>
+      <w:pPr>
+        <w:spacing w:line="360" w:lineRule="auto" w:before="0" w:after="120"/>
+        <w:ind w:firstLine="420"/>
+        <w:jc w:val="both"/>
+      </w:pPr>
+      <w:r>
+        <w:rPr>
+          <w:rFonts w:ascii="Times New Roman" w:hAnsi="Times New Roman" w:eastAsia="宋体"/>
+          <w:b w:val="0"/>
+          <w:sz w:val="21"/>
+        </w:rPr>
+        <w:t>常折射率结果作为基线。升级后的色散坐标多峰谷模型得到本征情景名义厚度</w:t>
+      </w:r>
+    </w:p>
+    <w:p>
+      <w:pPr>
+        <w:spacing w:line="360" w:lineRule="auto" w:before="0" w:after="120"/>
+        <w:ind w:firstLine="0"/>
+        <w:jc w:val="center"/>
+      </w:pPr>
+      <w:r>
+        <w:rPr>
+          <w:rFonts w:ascii="Times New Roman" w:hAnsi="Times New Roman" w:eastAsia="宋体"/>
+          <w:b w:val="0"/>
+          <w:sz w:val="21"/>
+        </w:rPr>
+        <w:t>d_SiC,v8 ≈ 7.452 µm　　(18)</w:t>
+      </w:r>
+    </w:p>
+    <w:p>
+      <w:pPr>
+        <w:spacing w:line="360" w:lineRule="auto" w:before="0" w:after="120"/>
+        <w:ind w:firstLine="0"/>
+        <w:jc w:val="both"/>
+      </w:pPr>
+      <w:r>
+        <w:rPr>
+          <w:rFonts w:ascii="Times New Roman" w:hAnsi="Times New Roman" w:eastAsia="宋体"/>
+          <w:b w:val="0"/>
+          <w:sz w:val="21"/>
+        </w:rPr>
+        <w:t>其条件统计95%区间约为[7.431,7.483] µm。峰、谷子模型分别约为7.434 µm和7.463 µm，相对差0.399%；10°和15°结果分别约为7.500 µm和7.412 µm，相对差1.175%；连续留段CV为0.738%，最大偏移为1.563%。39个合格极值均被保留，全部稳定性条件通过，因此采用7.452 µm作为SiC名义厚度。低、中、高固定情景及常折射率基线共同形成约7.368–7.832 µm的模型系统范围。该范围描述折射率设定的不确定性，不是统计置信区间，也不表示测得了载流子浓度。自由浓度审计中，连续留段厚度变异系数约 8.69%，最大偏移约 14.99%，均超过稳定性门槛；自由拟合误差还劣于最佳固定情景，因此浓度不可唯一辨识。</w:t>
       </w:r>
     </w:p>
     <w:p>
@@ -2634,6 +2889,88 @@
     </w:p>
     <w:p>
       <w:pPr>
+        <w:spacing w:line="360" w:lineRule="auto" w:before="0" w:after="120"/>
+        <w:ind w:firstLine="0"/>
+        <w:jc w:val="center"/>
+        <w:pBdr>
+          <w:top w:val="single" w:sz="12" w:space="4" w:color="C00000"/>
+          <w:left w:val="single" w:sz="12" w:space="4" w:color="C00000"/>
+          <w:bottom w:val="single" w:sz="12" w:space="4" w:color="C00000"/>
+          <w:right w:val="single" w:sz="12" w:space="4" w:color="C00000"/>
+        </w:pBdr>
+      </w:pPr>
+      <w:r>
+        <w:rPr>
+          <w:rFonts w:ascii="Times New Roman" w:hAnsi="Times New Roman" w:eastAsia="宋体"/>
+          <w:b w:val="0"/>
+          <w:color w:val="800000"/>
+          <w:sz w:val="21"/>
+        </w:rPr>
+        <w:t>【插图预留：图8】</w:t>
+        <w:br/>
+        <w:t>请插入：output/raw_evidence/extrema/sic_intrinsic_order_fit_raw.png</w:t>
+        <w:br/>
+        <w:t>建议居中，宽约 12–14 cm</w:t>
+      </w:r>
+    </w:p>
+    <w:p>
+      <w:pPr>
+        <w:spacing w:line="360" w:lineRule="auto" w:before="0" w:after="120"/>
+        <w:ind w:firstLine="0"/>
+        <w:jc w:val="center"/>
+      </w:pPr>
+      <w:r>
+        <w:rPr>
+          <w:rFonts w:ascii="Times New Roman" w:hAnsi="Times New Roman" w:eastAsia="黑体"/>
+          <w:b/>
+          <w:sz w:val="21"/>
+        </w:rPr>
+        <w:t>图8  SiC本征色散坐标多峰谷级次回归</w:t>
+      </w:r>
+    </w:p>
+    <w:p>
+      <w:pPr>
+        <w:spacing w:line="360" w:lineRule="auto" w:before="0" w:after="120"/>
+        <w:ind w:firstLine="0"/>
+        <w:jc w:val="center"/>
+        <w:pBdr>
+          <w:top w:val="single" w:sz="12" w:space="4" w:color="C00000"/>
+          <w:left w:val="single" w:sz="12" w:space="4" w:color="C00000"/>
+          <w:bottom w:val="single" w:sz="12" w:space="4" w:color="C00000"/>
+          <w:right w:val="single" w:sz="12" w:space="4" w:color="C00000"/>
+        </w:pBdr>
+      </w:pPr>
+      <w:r>
+        <w:rPr>
+          <w:rFonts w:ascii="Times New Roman" w:hAnsi="Times New Roman" w:eastAsia="宋体"/>
+          <w:b w:val="0"/>
+          <w:color w:val="800000"/>
+          <w:sz w:val="21"/>
+        </w:rPr>
+        <w:t>【插图预留：图9】</w:t>
+        <w:br/>
+        <w:t>请插入：output/raw_evidence/extrema/sic_10_mapped_spacing_raw.png</w:t>
+        <w:br/>
+        <w:t>建议居中，宽约 12–14 cm</w:t>
+      </w:r>
+    </w:p>
+    <w:p>
+      <w:pPr>
+        <w:spacing w:line="360" w:lineRule="auto" w:before="0" w:after="120"/>
+        <w:ind w:firstLine="0"/>
+        <w:jc w:val="center"/>
+      </w:pPr>
+      <w:r>
+        <w:rPr>
+          <w:rFonts w:ascii="Times New Roman" w:hAnsi="Times New Roman" w:eastAsia="黑体"/>
+          <w:b/>
+          <w:sz w:val="21"/>
+        </w:rPr>
+        <w:t>图9  SiC双角度色散坐标相邻间距</w:t>
+      </w:r>
+    </w:p>
+    <w:p>
+      <w:pPr>
         <w:spacing w:line="360" w:lineRule="auto" w:before="160" w:after="120"/>
         <w:ind w:firstLine="0"/>
         <w:jc w:val="both"/>
@@ -2659,7 +2996,7 @@
           <w:b w:val="0"/>
           <w:sz w:val="21"/>
         </w:rPr>
-        <w:t>问题二得到碳化硅外延层厚度约 7.83 µm，双角度相对差约 1.16%，并给出条件置信区间与折射率系统误差说明。该结果作为问题三多光束判定的对照基线。</w:t>
+        <w:t>问题二在常折射率条件下得到约7.83 µm的基线结果；升级后的色散坐标多峰谷模型得到SiC名义厚度约7.45 µm，条件统计95%区间约为[7.43,7.48] µm，固定色散情景与常折射率基线给出约7.37–7.83 µm的模型系统范围。自由浓度审计证明现有数据不能支持唯一浓度点估计，因此增强结果仅用于可靠性与模型评价。该结果作为问题三多光束判定的对照基线。</w:t>
       </w:r>
     </w:p>
     <w:p>
@@ -2779,7 +3116,7 @@
           <w:b w:val="0"/>
           <w:sz w:val="21"/>
         </w:rPr>
-        <w:t>q = r₁₀ r₁₂ exp(−2αd/cosθ₁) exp(iδ)　　(14)</w:t>
+        <w:t>q = r₁₀ r₁₂ exp(−2αd/cosθ₁) exp(iδ)　　(19)</w:t>
       </w:r>
     </w:p>
     <w:p>
@@ -2839,7 +3176,7 @@
           <w:b w:val="0"/>
           <w:sz w:val="21"/>
         </w:rPr>
-        <w:t>r_tot = (r₀₁ + r₁₂ e^{2iβ}) / (1 + r₀₁ r₁₂ e^{2iβ})， β=2π d ν̃ n cosθ₁　　(15)</w:t>
+        <w:t>r_tot = (r₀₁ + r₁₂ e^{2iβ}) / (1 + r₀₁ r₁₂ e^{2iβ})， β=2π d ν̃ n cosθ₁　　(20)</w:t>
       </w:r>
     </w:p>
     <w:p>
@@ -2869,7 +3206,7 @@
           <w:b w:val="0"/>
           <w:sz w:val="21"/>
         </w:rPr>
-        <w:t>T=1/[1+F sin²(δ/2)]， F=4Rᵢ/(1−Rᵢ)²， R_Airy=1−T　　(16)</w:t>
+        <w:t>T=1/[1+F sin²(δ/2)]， F=4Rᵢ/(1−Rᵢ)²， R_Airy=1−T　　(21)</w:t>
       </w:r>
     </w:p>
     <w:p>
@@ -2929,7 +3266,7 @@
           <w:b w:val="0"/>
           <w:sz w:val="21"/>
         </w:rPr>
-        <w:t>A₂/A₁≥0.08， Rᵢ≥0.12， RMSE改善≥2%， ΔAICc≥10　　(17)</w:t>
+        <w:t>A₂/A₁≥0.08， Rᵢ≥0.12， RMSE改善≥2%， ΔAICc≥10　　(22)</w:t>
       </w:r>
     </w:p>
     <w:p>
@@ -3638,7 +3975,7 @@
           <w:color w:val="800000"/>
           <w:sz w:val="21"/>
         </w:rPr>
-        <w:t>【插图预留：图8】</w:t>
+        <w:t>【插图预留：图10】</w:t>
         <w:br/>
         <w:t>请插入：output/multibeam_evidence.png</w:t>
         <w:br/>
@@ -3657,7 +3994,7 @@
           <w:b/>
           <w:sz w:val="21"/>
         </w:rPr>
-        <w:t>图8  多光束证据矩阵</w:t>
+        <w:t>图10  多光束证据矩阵</w:t>
       </w:r>
     </w:p>
     <w:p>
@@ -3679,7 +4016,7 @@
           <w:color w:val="800000"/>
           <w:sz w:val="21"/>
         </w:rPr>
-        <w:t>【插图预留：图9】</w:t>
+        <w:t>【插图预留：图11】</w:t>
         <w:br/>
         <w:t>请插入：output/model_quality.png</w:t>
         <w:br/>
@@ -3698,7 +4035,7 @@
           <w:b/>
           <w:sz w:val="21"/>
         </w:rPr>
-        <w:t>图9  模型质量对比</w:t>
+        <w:t>图11  模型质量对比</w:t>
       </w:r>
     </w:p>
     <w:p>
@@ -3720,7 +4057,7 @@
           <w:color w:val="800000"/>
           <w:sz w:val="21"/>
         </w:rPr>
-        <w:t>【插图预留：图10】</w:t>
+        <w:t>【插图预留：图12】</w:t>
         <w:br/>
         <w:t>请插入：output/raw_evidence/multibeam/harmonic_ratio_raw.png</w:t>
         <w:br/>
@@ -3739,7 +4076,7 @@
           <w:b/>
           <w:sz w:val="21"/>
         </w:rPr>
-        <w:t>图10  谐波比原始图</w:t>
+        <w:t>图12  谐波比原始图</w:t>
       </w:r>
     </w:p>
     <w:p>
@@ -3761,7 +4098,7 @@
           <w:color w:val="800000"/>
           <w:sz w:val="21"/>
         </w:rPr>
-        <w:t>【插图预留：图11】</w:t>
+        <w:t>【插图预留：图13】</w:t>
         <w:br/>
         <w:t>请插入：output/raw_evidence/multibeam/effective_reflectivity_raw.png</w:t>
         <w:br/>
@@ -3780,7 +4117,7 @@
           <w:b/>
           <w:sz w:val="21"/>
         </w:rPr>
-        <w:t>图11  有效反射率原始图</w:t>
+        <w:t>图13  有效反射率原始图</w:t>
       </w:r>
     </w:p>
     <w:p>
@@ -3802,7 +4139,7 @@
           <w:color w:val="800000"/>
           <w:sz w:val="21"/>
         </w:rPr>
-        <w:t>【插图预留：图12】</w:t>
+        <w:t>【插图预留：图14】</w:t>
         <w:br/>
         <w:t>请插入：output/raw_evidence/multibeam/si_10_harmonic_spectrum_raw.png</w:t>
         <w:br/>
@@ -3821,7 +4158,7 @@
           <w:b/>
           <w:sz w:val="21"/>
         </w:rPr>
-        <w:t>图12  Si 10°谐波频谱</w:t>
+        <w:t>图14  Si 10°谐波频谱</w:t>
       </w:r>
     </w:p>
     <w:p>
@@ -3843,7 +4180,7 @@
           <w:color w:val="800000"/>
           <w:sz w:val="21"/>
         </w:rPr>
-        <w:t>【插图预留：图13】</w:t>
+        <w:t>【插图预留：图15】</w:t>
         <w:br/>
         <w:t>请插入：output/raw_evidence/multibeam/sic_10_harmonic_spectrum_raw.png</w:t>
         <w:br/>
@@ -3862,7 +4199,7 @@
           <w:b/>
           <w:sz w:val="21"/>
         </w:rPr>
-        <w:t>图13  SiC 10°谐波频谱</w:t>
+        <w:t>图15  SiC 10°谐波频谱</w:t>
       </w:r>
     </w:p>
     <w:p>
@@ -3884,7 +4221,7 @@
           <w:color w:val="800000"/>
           <w:sz w:val="21"/>
         </w:rPr>
-        <w:t>【插图预留：图14】</w:t>
+        <w:t>【插图预留：图16】</w:t>
         <w:br/>
         <w:t>请插入：output/si_10_fit.png</w:t>
         <w:br/>
@@ -3903,7 +4240,7 @@
           <w:b/>
           <w:sz w:val="21"/>
         </w:rPr>
-        <w:t>图14  附件3拟合证据图</w:t>
+        <w:t>图16  附件3拟合证据图</w:t>
       </w:r>
     </w:p>
     <w:p>
@@ -3925,7 +4262,7 @@
           <w:color w:val="800000"/>
           <w:sz w:val="21"/>
         </w:rPr>
-        <w:t>【插图预留：图15】</w:t>
+        <w:t>【插图预留：图17】</w:t>
         <w:br/>
         <w:t>请插入：output/si_15_fit.png</w:t>
         <w:br/>
@@ -3944,7 +4281,7 @@
           <w:b/>
           <w:sz w:val="21"/>
         </w:rPr>
-        <w:t>图15  附件4拟合证据图</w:t>
+        <w:t>图17  附件4拟合证据图</w:t>
       </w:r>
     </w:p>
     <w:p>
@@ -4490,7 +4827,7 @@
           <w:b w:val="0"/>
           <w:sz w:val="21"/>
         </w:rPr>
-        <w:t>d_Si ≈ 3.59 µm　　(18)</w:t>
+        <w:t>d_Si ≈ 3.59 µm　　(23)</w:t>
       </w:r>
     </w:p>
     <w:p>
@@ -4505,7 +4842,7 @@
           <w:b w:val="0"/>
           <w:sz w:val="21"/>
         </w:rPr>
-        <w:t>若硅片仍用双光束，联合厚度约 3.41 µm，相对多光束联合结果偏低约 5%。碳化硅因不满足四项证据门控，仍采用问题二的双光束结果。</w:t>
+        <w:t>若硅片仍用双光束，联合厚度约 3.41 µm，相对多光束联合结果偏低约 5%。色散坐标多峰谷模型对硅给出约3.400 µm的候选值，但峰谷差为4.771%、留段CV为3.168%，且与Airy结果相差5.419%，故按门控回退多光束模型。碳化硅因不满足四项多光束证据门控，仍采用问题二的双光束机理与色散坐标名义厚度。</w:t>
       </w:r>
     </w:p>
     <w:p>
@@ -4535,7 +4872,7 @@
           <w:b w:val="0"/>
           <w:sz w:val="21"/>
         </w:rPr>
-        <w:t>问题三建立了多光束可观测条件、Airy 模型与四项证据门控。结论：附件三、四存在可观察多光束干涉，d_Si≈3.59 µm；附件一、二证据不足，SiC 不作多光束修正，d_SiC≈7.83 µm。</w:t>
+        <w:t>问题三建立了多光束可观测条件、Airy 模型与四项证据门控。结论：附件三、四存在可观察多光束干涉，色散坐标极值候选未通过稳定性门控，故d_Si≈3.59 µm；附件一、二多光束证据不足，SiC不作多光束修正，采用问题二色散坐标结果d_SiC≈7.45 µm。</w:t>
       </w:r>
     </w:p>
     <w:sectPr>

</xml_diff>

<commit_message>
feat: Add v9 analysis evidence visualization system and update related documentation
- Introduced a new module `evidence_plotting.py` for generating analysis evidence plots.
- Updated `04-test-report.md` and `05-retrospective.md` to include v9 system testing results and analysis evidence insights.
- Enhanced `main.py` to integrate the new plotting functionality and utilize shared thresholds for consistency checks.
- Refactored `shared_thickness.py` to define thresholds for model validation.
- Added unit tests in `test_model.py` to ensure the integrity of the new analysis evidence generation.
- Improved plotting functions to save figures with explicit file paths and ensure all required metrics are visualized.
</commit_message>
<xml_diff>
--- a/doc/2025B论文_问题一二三_详细版.docx
+++ b/doc/2025B论文_问题一二三_详细版.docx
@@ -2908,7 +2908,7 @@
         </w:rPr>
         <w:t>【插图预留：图8】</w:t>
         <w:br/>
-        <w:t>请插入：output/raw_evidence/extrema/sic_intrinsic_order_fit_raw.png</w:t>
+        <w:t>请插入：output/analysis_evidence/sic_band_eligibility_analysis.png</w:t>
         <w:br/>
         <w:t>建议居中，宽约 12–14 cm</w:t>
       </w:r>
@@ -2925,7 +2925,7 @@
           <w:b/>
           <w:sz w:val="21"/>
         </w:rPr>
-        <w:t>图8  SiC本征色散坐标多峰谷级次回归</w:t>
+        <w:t>图8  SiC厚度反演波段与极值资格</w:t>
       </w:r>
     </w:p>
     <w:p>
@@ -2949,7 +2949,7 @@
         </w:rPr>
         <w:t>【插图预留：图9】</w:t>
         <w:br/>
-        <w:t>请插入：output/raw_evidence/extrema/sic_10_mapped_spacing_raw.png</w:t>
+        <w:t>请插入：output/analysis_evidence/sic_order_fit_analysis.png</w:t>
         <w:br/>
         <w:t>建议居中，宽约 12–14 cm</w:t>
       </w:r>
@@ -2966,7 +2966,48 @@
           <w:b/>
           <w:sz w:val="21"/>
         </w:rPr>
-        <w:t>图9  SiC双角度色散坐标相邻间距</w:t>
+        <w:t>图9  SiC色散坐标多峰谷共享厚度回归</w:t>
+      </w:r>
+    </w:p>
+    <w:p>
+      <w:pPr>
+        <w:spacing w:line="360" w:lineRule="auto" w:before="0" w:after="120"/>
+        <w:ind w:firstLine="0"/>
+        <w:jc w:val="center"/>
+        <w:pBdr>
+          <w:top w:val="single" w:sz="12" w:space="4" w:color="C00000"/>
+          <w:left w:val="single" w:sz="12" w:space="4" w:color="C00000"/>
+          <w:bottom w:val="single" w:sz="12" w:space="4" w:color="C00000"/>
+          <w:right w:val="single" w:sz="12" w:space="4" w:color="C00000"/>
+        </w:pBdr>
+      </w:pPr>
+      <w:r>
+        <w:rPr>
+          <w:rFonts w:ascii="Times New Roman" w:hAnsi="Times New Roman" w:eastAsia="宋体"/>
+          <w:b w:val="0"/>
+          <w:color w:val="800000"/>
+          <w:sz w:val="21"/>
+        </w:rPr>
+        <w:t>【插图预留：图10】</w:t>
+        <w:br/>
+        <w:t>请插入：output/analysis_evidence/sic_stability_gates_analysis.png</w:t>
+        <w:br/>
+        <w:t>建议居中，宽约 12–14 cm</w:t>
+      </w:r>
+    </w:p>
+    <w:p>
+      <w:pPr>
+        <w:spacing w:line="360" w:lineRule="auto" w:before="0" w:after="120"/>
+        <w:ind w:firstLine="0"/>
+        <w:jc w:val="center"/>
+      </w:pPr>
+      <w:r>
+        <w:rPr>
+          <w:rFonts w:ascii="Times New Roman" w:hAnsi="Times New Roman" w:eastAsia="黑体"/>
+          <w:b/>
+          <w:sz w:val="21"/>
+        </w:rPr>
+        <w:t>图10  SiC稳定性与模型采用门控</w:t>
       </w:r>
     </w:p>
     <w:p>
@@ -3975,7 +4016,7 @@
           <w:color w:val="800000"/>
           <w:sz w:val="21"/>
         </w:rPr>
-        <w:t>【插图预留：图10】</w:t>
+        <w:t>【插图预留：图11】</w:t>
         <w:br/>
         <w:t>请插入：output/multibeam_evidence.png</w:t>
         <w:br/>
@@ -3994,7 +4035,7 @@
           <w:b/>
           <w:sz w:val="21"/>
         </w:rPr>
-        <w:t>图10  多光束证据矩阵</w:t>
+        <w:t>图11  多光束证据矩阵</w:t>
       </w:r>
     </w:p>
     <w:p>
@@ -4016,7 +4057,7 @@
           <w:color w:val="800000"/>
           <w:sz w:val="21"/>
         </w:rPr>
-        <w:t>【插图预留：图11】</w:t>
+        <w:t>【插图预留：图12】</w:t>
         <w:br/>
         <w:t>请插入：output/model_quality.png</w:t>
         <w:br/>
@@ -4035,7 +4076,7 @@
           <w:b/>
           <w:sz w:val="21"/>
         </w:rPr>
-        <w:t>图11  模型质量对比</w:t>
+        <w:t>图12  模型质量对比</w:t>
       </w:r>
     </w:p>
     <w:p>
@@ -4057,7 +4098,7 @@
           <w:color w:val="800000"/>
           <w:sz w:val="21"/>
         </w:rPr>
-        <w:t>【插图预留：图12】</w:t>
+        <w:t>【插图预留：图13】</w:t>
         <w:br/>
         <w:t>请插入：output/raw_evidence/multibeam/harmonic_ratio_raw.png</w:t>
         <w:br/>
@@ -4076,7 +4117,7 @@
           <w:b/>
           <w:sz w:val="21"/>
         </w:rPr>
-        <w:t>图12  谐波比原始图</w:t>
+        <w:t>图13  谐波比原始图</w:t>
       </w:r>
     </w:p>
     <w:p>
@@ -4098,7 +4139,7 @@
           <w:color w:val="800000"/>
           <w:sz w:val="21"/>
         </w:rPr>
-        <w:t>【插图预留：图13】</w:t>
+        <w:t>【插图预留：图14】</w:t>
         <w:br/>
         <w:t>请插入：output/raw_evidence/multibeam/effective_reflectivity_raw.png</w:t>
         <w:br/>
@@ -4117,7 +4158,7 @@
           <w:b/>
           <w:sz w:val="21"/>
         </w:rPr>
-        <w:t>图13  有效反射率原始图</w:t>
+        <w:t>图14  有效反射率原始图</w:t>
       </w:r>
     </w:p>
     <w:p>
@@ -4139,7 +4180,7 @@
           <w:color w:val="800000"/>
           <w:sz w:val="21"/>
         </w:rPr>
-        <w:t>【插图预留：图14】</w:t>
+        <w:t>【插图预留：图15】</w:t>
         <w:br/>
         <w:t>请插入：output/raw_evidence/multibeam/si_10_harmonic_spectrum_raw.png</w:t>
         <w:br/>
@@ -4158,7 +4199,7 @@
           <w:b/>
           <w:sz w:val="21"/>
         </w:rPr>
-        <w:t>图14  Si 10°谐波频谱</w:t>
+        <w:t>图15  Si 10°谐波频谱</w:t>
       </w:r>
     </w:p>
     <w:p>
@@ -4180,7 +4221,7 @@
           <w:color w:val="800000"/>
           <w:sz w:val="21"/>
         </w:rPr>
-        <w:t>【插图预留：图15】</w:t>
+        <w:t>【插图预留：图16】</w:t>
         <w:br/>
         <w:t>请插入：output/raw_evidence/multibeam/sic_10_harmonic_spectrum_raw.png</w:t>
         <w:br/>
@@ -4199,7 +4240,7 @@
           <w:b/>
           <w:sz w:val="21"/>
         </w:rPr>
-        <w:t>图15  SiC 10°谐波频谱</w:t>
+        <w:t>图16  SiC 10°谐波频谱</w:t>
       </w:r>
     </w:p>
     <w:p>
@@ -4221,7 +4262,7 @@
           <w:color w:val="800000"/>
           <w:sz w:val="21"/>
         </w:rPr>
-        <w:t>【插图预留：图16】</w:t>
+        <w:t>【插图预留：图17】</w:t>
         <w:br/>
         <w:t>请插入：output/si_10_fit.png</w:t>
         <w:br/>
@@ -4240,7 +4281,7 @@
           <w:b/>
           <w:sz w:val="21"/>
         </w:rPr>
-        <w:t>图16  附件3拟合证据图</w:t>
+        <w:t>图17  附件3拟合证据图</w:t>
       </w:r>
     </w:p>
     <w:p>
@@ -4262,7 +4303,7 @@
           <w:color w:val="800000"/>
           <w:sz w:val="21"/>
         </w:rPr>
-        <w:t>【插图预留：图17】</w:t>
+        <w:t>【插图预留：图18】</w:t>
         <w:br/>
         <w:t>请插入：output/si_15_fit.png</w:t>
         <w:br/>
@@ -4281,7 +4322,89 @@
           <w:b/>
           <w:sz w:val="21"/>
         </w:rPr>
-        <w:t>图17  附件4拟合证据图</w:t>
+        <w:t>图18  附件4拟合证据图</w:t>
+      </w:r>
+    </w:p>
+    <w:p>
+      <w:pPr>
+        <w:spacing w:line="360" w:lineRule="auto" w:before="0" w:after="120"/>
+        <w:ind w:firstLine="0"/>
+        <w:jc w:val="center"/>
+        <w:pBdr>
+          <w:top w:val="single" w:sz="12" w:space="4" w:color="C00000"/>
+          <w:left w:val="single" w:sz="12" w:space="4" w:color="C00000"/>
+          <w:bottom w:val="single" w:sz="12" w:space="4" w:color="C00000"/>
+          <w:right w:val="single" w:sz="12" w:space="4" w:color="C00000"/>
+        </w:pBdr>
+      </w:pPr>
+      <w:r>
+        <w:rPr>
+          <w:rFonts w:ascii="Times New Roman" w:hAnsi="Times New Roman" w:eastAsia="宋体"/>
+          <w:b w:val="0"/>
+          <w:color w:val="800000"/>
+          <w:sz w:val="21"/>
+        </w:rPr>
+        <w:t>【插图预留：图19】</w:t>
+        <w:br/>
+        <w:t>请插入：output/analysis_evidence/si_stability_gates_analysis.png</w:t>
+        <w:br/>
+        <w:t>建议居中，宽约 12–14 cm</w:t>
+      </w:r>
+    </w:p>
+    <w:p>
+      <w:pPr>
+        <w:spacing w:line="360" w:lineRule="auto" w:before="0" w:after="120"/>
+        <w:ind w:firstLine="0"/>
+        <w:jc w:val="center"/>
+      </w:pPr>
+      <w:r>
+        <w:rPr>
+          <w:rFonts w:ascii="Times New Roman" w:hAnsi="Times New Roman" w:eastAsia="黑体"/>
+          <w:b/>
+          <w:sz w:val="21"/>
+        </w:rPr>
+        <w:t>图19  Si色散坐标模型稳定性与回退依据</w:t>
+      </w:r>
+    </w:p>
+    <w:p>
+      <w:pPr>
+        <w:spacing w:line="360" w:lineRule="auto" w:before="0" w:after="120"/>
+        <w:ind w:firstLine="0"/>
+        <w:jc w:val="center"/>
+        <w:pBdr>
+          <w:top w:val="single" w:sz="12" w:space="4" w:color="C00000"/>
+          <w:left w:val="single" w:sz="12" w:space="4" w:color="C00000"/>
+          <w:bottom w:val="single" w:sz="12" w:space="4" w:color="C00000"/>
+          <w:right w:val="single" w:sz="12" w:space="4" w:color="C00000"/>
+        </w:pBdr>
+      </w:pPr>
+      <w:r>
+        <w:rPr>
+          <w:rFonts w:ascii="Times New Roman" w:hAnsi="Times New Roman" w:eastAsia="宋体"/>
+          <w:b w:val="0"/>
+          <w:color w:val="800000"/>
+          <w:sz w:val="21"/>
+        </w:rPr>
+        <w:t>【插图预留：图20】</w:t>
+        <w:br/>
+        <w:t>请插入：output/analysis_evidence/final_model_decision_analysis.png</w:t>
+        <w:br/>
+        <w:t>建议居中，宽约 12–14 cm</w:t>
+      </w:r>
+    </w:p>
+    <w:p>
+      <w:pPr>
+        <w:spacing w:line="360" w:lineRule="auto" w:before="0" w:after="120"/>
+        <w:ind w:firstLine="0"/>
+        <w:jc w:val="center"/>
+      </w:pPr>
+      <w:r>
+        <w:rPr>
+          <w:rFonts w:ascii="Times New Roman" w:hAnsi="Times New Roman" w:eastAsia="黑体"/>
+          <w:b/>
+          <w:sz w:val="21"/>
+        </w:rPr>
+        <w:t>图20  最终厚度模型决策</w:t>
       </w:r>
     </w:p>
     <w:p>

</xml_diff>